<commit_message>
v1.1: correct Section 1.3 tidal figures, cite adjacent transit-network and settlement literature
Two tidal-force values were wrong by factors of ~26 and ~280 under a
'calculations verified' stamp: at 100 r_s of a 10-solar-mass hole the load
is ~1,000 g per 100 m (not 38 g; 38 g applies beyond ~300 r_s), and a
1,000-solar-mass hole at 10 r_s gives ~100 g (not 0.37 g; sub-1 g beyond
~65 r_s). Adds the uncited adjacent work: Carroll-Nellenback et al. 2019
(settlement quasi-voids), arXiv:2210.10622 (black-hole slingshot travel),
arXiv:2510.00377 (constructed transit networks), and repositions this
paper's contribution as the quantified node-isolation metric with
pre-committed falsification. Metadata: v1.1, RELEASED.
</commit_message>
<xml_diff>
--- a/SolarIsolationHypothesis-WhitePaper.docx
+++ b/SolarIsolationHypothesis-WhitePaper.docx
@@ -3687,7 +3687,7 @@
         <w:spacing w:after="60"/>
       </w:pPr>
       <w:r>
-        <w:t>At r = 100r_s (3,000 km): Tidal acceleration drops to roughly 38 g per 100 metres—severe but potentially survivable for reinforced structures.</w:t>
+        <w:t>At r = 100 r_s (roughly 3,000 km): tidal acceleration is still near 1,000 g per 100 metres. Loads fall to the order of 38 g—severe but potentially survivable for reinforced structures—only beyond roughly 300 r_s (about 9,000 km).</w:t>
       </w:r>
     </w:p>
     <w:p>
@@ -3700,7 +3700,7 @@
         <w:spacing w:after="60"/>
       </w:pPr>
       <w:r>
-        <w:t>For intermediate-mass black holes (1,000 solar masses): At 10 Schwarzschild radii, tidal acceleration falls to about 0.37 g per 100 metres.</w:t>
+        <w:t>For intermediate-mass black holes (1,000 solar masses): at 10 Schwarzschild radii tidal acceleration is roughly 100 g per 100 metres, falling below 1 g beyond about 65 r_s—the far gentler gradient that makes the intermediate-mass class the plausible transit candidate.</w:t>
       </w:r>
     </w:p>
     <w:p>
@@ -6115,6 +6115,11 @@
       </w:r>
     </w:p>
     <w:p>
+      <w:r>
+        <w:t>Adjacent work. Components of this framework exist separately in prior and contemporaneous literature that the first release failed to cite. Carroll-Nellenback et al. (2019) showed that settlement simulations naturally produce co-existing occupied clusters and unvisited quasi-voids—geography as a Fermi answer, without invoking transit infrastructure. Black-hole slingshot travel between galaxies is analysed in arXiv:2210.10622 (2022), and constructed black-hole transit networks with Fermi implications in arXiv:2510.00377 (2025). Against that landscape this paper’s contribution is deliberately narrow: a quantified isolation metric—Earth’s distance to the nearest known black hole measured against expected node separations—carrying pre-committed observational falsification criteria.</w:t>
+      </w:r>
+    </w:p>
+    <w:p>
       <w:pPr>
         <w:pStyle w:val="Heading2"/>
       </w:pPr>
@@ -6993,6 +6998,13 @@
     </w:p>
     <w:p>
       <w:r>
+        <w:t>Carroll-Nellenback, J., Frank, A., Wright, J.T., &amp; Scharf, C. (2019). “The Fermi Paradox and the Aurora Effect: Exo-civilization Settlement, Expansion, and Steady States.” The Astronomical Journal, 158(3), 117. arXiv:1902.04450.</w:t>
+      </w:r>
+      <w:proofErr w:type="spellStart"/>
+      <w:proofErr w:type="spellEnd"/>
+    </w:p>
+    <w:p>
+      <w:r>
         <w:t>Ćirković, M.M. (2018). The Great Silence: Science and Philosophy of Fermi's Paradox. Oxford University Press.</w:t>
       </w:r>
     </w:p>
@@ -7084,6 +7096,20 @@
       <w:r>
         <w:t>, 78, 55–68.</w:t>
       </w:r>
+    </w:p>
+    <w:p>
+      <w:r>
+        <w:t>“Exploration of M31 via Black-Hole Slingshots and the ‘Intergalactic Imperative’.” arXiv:2210.10622 (2022).</w:t>
+      </w:r>
+      <w:proofErr w:type="spellStart"/>
+      <w:proofErr w:type="spellEnd"/>
+    </w:p>
+    <w:p>
+      <w:r>
+        <w:t>“Redshifted civilizations, galactic empires, and the Fermi paradox.” arXiv:2510.00377 (2025); Acta Astronautica (2026).</w:t>
+      </w:r>
+      <w:proofErr w:type="spellStart"/>
+      <w:proofErr w:type="spellEnd"/>
     </w:p>
     <w:p>
       <w:r>
@@ -7978,7 +8004,7 @@
           </w:tcPr>
           <w:p>
             <w:r>
-              <w:t>1.0</w:t>
+              <w:t>1.1</w:t>
             </w:r>
           </w:p>
         </w:tc>
@@ -8012,7 +8038,7 @@
           </w:tcPr>
           <w:p>
             <w:r>
-              <w:t>01 January 2026</w:t>
+              <w:t>8 August 2026 (v1.1)</w:t>
             </w:r>
           </w:p>
         </w:tc>
@@ -8080,7 +8106,7 @@
           </w:tcPr>
           <w:p>
             <w:r>
-              <w:t>Desk Research and Independent Inquiry</w:t>
+              <w:t>Independent inquiry, revised under adversarial review</w:t>
             </w:r>
           </w:p>
         </w:tc>
@@ -8182,7 +8208,7 @@
           </w:tcPr>
           <w:p>
             <w:r>
-              <w:t>Final Draft</w:t>
+              <w:t>RELEASED</w:t>
             </w:r>
           </w:p>
         </w:tc>
@@ -8302,7 +8328,7 @@
         <w:spacing w:after="60"/>
       </w:pPr>
       <w:r>
-        <w:t>Mathematical calculations verified</w:t>
+        <w:t>Mathematical calculations reviewed (v1.1 subsequently corrected two tidal-force figures in Section 1.3)</w:t>
       </w:r>
     </w:p>
     <w:p>

</xml_diff>